<commit_message>
Update text for the DESeq2 and WGCNA re-run
Manuscript, draft, illustrated manuscript, README, site and the SA
comparison now report the averaged flight main effects (leaf 2,683
DEGs; root 1,501, 83% up), the black module's padj of 0.009 over 12
plants, its within-flight and within-ground correlations, and that the
ITS dysbiosis index itself correlates with flight (r = 0.70). Methods
describe the main-effect contrasts, the shrinkage and the per-trait n.
The Table S5 TODO is removed; S5 is re-derived.

rnaseq/RERUN_2026-10-14.md records inputs, controls and every number.

Co-Authored-By: Claude Opus 5.5 <noreply@anthropic.com>
</commit_message>
<xml_diff>
--- a/manuscript_with_figures.docx
+++ b/manuscript_with_figures.docx
@@ -37,7 +37,7 @@
         <w:t>Solanum lycopersicum</w:t>
       </w:r>
       <w:r>
-        <w:t xml:space="preserve"> cv. Red Robin) grown aboard the International Space Station (ISS) as part of the VEG-05 experiment, integrating 16S rRNA and ITS amplicon sequencing (OSD-766) with host transcriptomics (OSD-767) across two tissues (leaf, adventitious root) and two light treatments (red-rich vs. blue-rich LED). DADA2 processing yielded 348 bacterial and 77 fungal ASVs from 142 and 141 samples respectively. Leaf bacterial community composition differed among flight and light groups (PERMANOVA R²=0.42 for the full flight × light model, p=0.001), and flight samples had higher bacterial alpha diversity (Observed ASVs: Flight 17.8–25.8 vs. Ground 10.0–15.2). The spaceflight transcriptional response was strongly light-dependent: under blue light, 4,716 differentially expressed genes (DEGs) were detected in leaves versus only 523 under red light. WGCNA identified a 169-gene adventitious root module correlated with fungal dysbiosis (r=−0.85, padj=0.001) but not with flight status (r=−0.38, padj=0.32), representing a microbe-driven host transcriptional signature independent of the direct spaceflight stimulus. MOFA+ integration across three omics layers confirmed a dominant flight-associated factor (48% transcriptome variance) </w:t>
+        <w:t xml:space="preserve"> cv. Red Robin) grown aboard the International Space Station (ISS) as part of the VEG-05 experiment, integrating 16S rRNA and ITS amplicon sequencing (OSD-766) with host transcriptomics (OSD-767) across two tissues (leaf, adventitious root) and two light treatments (red-rich vs. blue-rich LED). DADA2 processing yielded 348 bacterial and 77 fungal ASVs from 142 and 141 samples respectively. Leaf bacterial community composition differed among flight and light groups (PERMANOVA R²=0.42 for the full flight × light model, p=0.001), and flight samples had higher bacterial alpha diversity (Observed ASVs: Flight 17.8–25.8 vs. Ground 10.0–15.2). The spaceflight transcriptional response was strongly light-dependent: under blue light, 4,716 differentially expressed genes (DEGs) were detected in leaves versus only 523 under red light. WGCNA identified a 169-gene adventitious root module correlated with fungal dysbiosis (r=−0.85, padj=0.009) but not with flight status (r=−0.38, padj=0.32), representing a microbe-driven host transcriptional signature independent of the direct spaceflight stimulus. MOFA+ integration across three omics layers confirmed a dominant flight-associated factor (48% transcriptome variance) </w:t>
       </w:r>
       <w:r>
         <w:rPr>
@@ -175,7 +175,7 @@
     </w:p>
     <w:p>
       <w:r>
-        <w:t>RNA-seq count matrices were analyzed with DESeq2 [12] separately for leaf (21 samples) and adventitious root (15 samples; Table S1). The design model included flight status, light treatment, and their interaction. Log-fold changes were shrunk with apeglm [13] for main effects and ashr [14] for subset contrasts. DEGs were defined as padj &lt; 0.05 and |log2FC| ≥ 1.</w:t>
+        <w:t>RNA-seq count matrices were analyzed with DESeq2 [12] separately for leaf (21 samples) and adventitious root (15 samples; Table S1). The design model included flight status, light treatment, and their interaction. Each main effect is the effect of one factor averaged over both levels of the other. Log-fold changes were shrunk with ashr [14] for the main effects and the within-light contrasts, and with apeglm [13] for the interaction term. DEGs were defined as padj &lt; 0.05 and |log2FC| ≥ 1.</w:t>
       </w:r>
     </w:p>
     <w:p>
@@ -201,7 +201,7 @@
     </w:p>
     <w:p>
       <w:r>
-        <w:t>WGCNA [7] was applied to variance-stabilized transcriptome data for each tissue separately. Soft-thresholding powers were selected to maximize scale-free fit (Leaf: power=20, R²=0.72; Adv-Root: power=18, R²=0.69). Module eigengenes were correlated (Pearson) with flight status, light treatment, and 16S/ITS dysbiosis indices. Hub genes were the 10 genes with the highest module membership (kME) in each module (all kME ≥ 0.86).</w:t>
+        <w:t>WGCNA [7] was applied to variance-stabilized transcriptome data for each tissue separately. Soft-thresholding powers were selected to maximize scale-free fit (Leaf: power=20, R²=0.72; Adv-Root: power=18, R²=0.69). Module eigengenes were correlated (Pearson) with flight status, light treatment, and the 16S/ITS dysbiosis indices of the same plant and tissue. A ground sample's index is its mean Bray-Curtis distance to the other ground samples of its compartment, over the same denominator, so ground indices average 1. Dysbiosis indices exist for 21 (16S) and 18 (ITS) of the 21 leaf samples and for 15 and 12 of the 15 adventitious-root samples; each correlation's p-value uses that number of samples. Hub genes were the 10 genes with the highest module membership (kME) in each module (all kME ≥ 0.86).</w:t>
       </w:r>
     </w:p>
     <w:p>
@@ -506,12 +506,12 @@
     </w:p>
     <w:p>
       <w:r>
-        <w:t>DESeq2 analysis revealed a pronounced interaction between spaceflight and light quality (Table S2). In leaves, the flight term of the flight × light model, which estimates the flight effect under red-rich light (the reference level), gave 757 DEGs (404 up, 353 down; Fig. 3B). Separate models within each light treatment gave 4,716 DEGs under blue-rich light and 523 under red-rich light (Fig. 3); the two red-rich estimates differ because they come from different models. The formal interaction term identified 3,189 DEGs, confirming that the transcriptional response to spaceflight is strongly modulated by light quality.</w:t>
+        <w:t>DESeq2 analysis revealed a pronounced interaction between spaceflight and light quality (Table S2). In leaves, the flight main effect (the flight effect averaged over the two light treatments) gave 2,683 DEGs (1,368 up, 1,315 down; Fig. 3B). Separate models within each light treatment gave 4,716 DEGs under blue-rich light and 523 under red-rich light (Fig. 3). The formal interaction term identified 3,189 DEGs, confirming that the transcriptional response to spaceflight is strongly modulated by light quality.</w:t>
       </w:r>
     </w:p>
     <w:p>
       <w:r>
-        <w:t>In adventitious roots, the flight term (red-rich reference level) was predominantly upregulation (896 DEGs: 783 up, 113 down, 87% upregulated; Fig. 3C), suggesting activation of stress response pathways. The interaction was minimal (6 DEGs after shrinkage), indicating that the root transcriptional response to spaceflight is less light-dependent than the leaf response.</w:t>
+        <w:t>In adventitious roots, the flight main effect was predominantly upregulation (1,501 DEGs: 1,245 up, 256 down, 83% upregulated; Fig. 3C), suggesting activation of stress response pathways. The interaction was minimal (6 DEGs after shrinkage), indicating that the root transcriptional response to spaceflight is less light-dependent than the leaf response.</w:t>
       </w:r>
     </w:p>
     <w:p>
@@ -611,7 +611,7 @@
         <w:t>*Figure 3B.</w:t>
       </w:r>
       <w:r>
-        <w:t xml:space="preserve"> Leaf Flight-vs-Ground volcano (flight term of the flight × light model: the flight effect under red-rich light, the reference level).*</w:t>
+        <w:t xml:space="preserve"> Leaf Flight-vs-Ground volcano (flight main effect of the flight × light model: the flight effect averaged over the two light treatments).*</w:t>
       </w:r>
     </w:p>
     <w:p>
@@ -661,7 +661,7 @@
         <w:t>*Figure 3C.</w:t>
       </w:r>
       <w:r>
-        <w:t xml:space="preserve"> Adventitious-root Flight-vs-Ground volcano (flight term at the red-rich reference level; predominantly upregulation).*</w:t>
+        <w:t xml:space="preserve"> Adventitious-root Flight-vs-Ground volcano (flight main effect, averaged over the two light treatments; predominantly upregulation).*</w:t>
       </w:r>
     </w:p>
     <w:p>
@@ -674,21 +674,12 @@
     </w:p>
     <w:p>
       <w:r>
-        <w:t xml:space="preserve">WGCNA of the leaf transcriptome identified 12 modules plus unassigned genes (power=20; Fig. 4), with the turquoise module (n=2,037 genes) showing the strongest flight correlation (r=+0.73, padj=0.001) and the blue module (n=1,012) showing the strongest anti-correlation (r=−0.79, padj=3×10⁻⁴). Four leaf modules were classified as co-regulated (correlated with both flight and dysbiosis), reflecting the intertwined nature of environmental and microbial signals (Table S5) </w:t>
-      </w:r>
-      <w:r>
-        <w:rPr>
-          <w:b/>
-        </w:rPr>
-        <w:t>[TODO: Table S5 was built from an earlier correlation table; re-derive]</w:t>
-      </w:r>
-      <w:r>
-        <w:t>.</w:t>
+        <w:t>WGCNA of the leaf transcriptome identified 12 modules plus unassigned genes (power=20; Fig. 4), with the turquoise module (n=2,037 genes) showing the strongest flight correlation (r=+0.73, padj=0.001) and the blue module (n=1,012) showing the strongest anti-correlation (r=−0.79, padj=3×10⁻⁴). Four leaf modules were classified as co-regulated (correlated with both flight and dysbiosis), reflecting the intertwined nature of environmental and microbial signals (Table S5).</w:t>
       </w:r>
     </w:p>
     <w:p>
       <w:r>
-        <w:t>In adventitious roots, WGCNA identified 16 modules plus unassigned genes (power=18). The key finding was the black module (n=169 genes), which was strongly correlated with ITS dysbiosis (r=−0.85, padj=0.001) but not with flight status (r=−0.38, padj=0.32). This module was classified as microbe-driven, representing a host transcriptional response to fungal community changes that is independent of the direct spaceflight stimulus. GO enrichment of the black module itself was limited — its only significantly enriched term was the cellular component "nucleus" — so it is defined here by its microbe-driven trait association rather than by a specific enriched process; the adventitious-root oxidative-stress program was instead concentrated in the larger turquoise module (see below).</w:t>
+        <w:t>In adventitious roots, WGCNA identified 16 modules plus unassigned genes (power=18). The key finding was the black module (n=169 genes), which was strongly correlated with ITS dysbiosis (r=−0.85, padj=0.009, 12 plants) but not with flight status (r=−0.38, padj=0.32). The correlation holds within flight plants (r=−0.87, n=6) and within ground plants (r=−0.75, n=6), although the ITS dysbiosis index is itself higher in flight (r=0.70 with flight status). The green module (n=287; ITS r=−0.72, padj=0.044) was also classified as microbe-driven, and the turquoise module as co-regulated (flight r=+0.72; ITS r=+0.74, padj=0.044). The black module was classified as microbe-driven, representing a host transcriptional response to fungal community changes that is independent of the direct spaceflight stimulus. GO enrichment of the black module itself was limited — its only significantly enriched term was the cellular component "nucleus" — so it is defined here by its microbe-driven trait association rather than by a specific enriched process; the adventitious-root oxidative-stress program was instead concentrated in the larger turquoise module (see below).</w:t>
       </w:r>
     </w:p>
     <w:p>
@@ -2820,7 +2811,7 @@
         <w:t>Figure 3B.</w:t>
       </w:r>
       <w:r>
-        <w:t xml:space="preserve"> Leaf Flight-vs-Ground volcano (flight term of the flight × light model: the flight effect under red-rich light, the reference level).</w:t>
+        <w:t xml:space="preserve"> Leaf Flight-vs-Ground volcano (flight main effect of the flight × light model: the flight effect averaged over the two light treatments).</w:t>
       </w:r>
     </w:p>
     <w:p>
@@ -2834,7 +2825,7 @@
         <w:t>Figure 3C.</w:t>
       </w:r>
       <w:r>
-        <w:t xml:space="preserve"> Adventitious-root Flight-vs-Ground volcano (flight term at the red-rich reference level; predominantly upregulation).</w:t>
+        <w:t xml:space="preserve"> Adventitious-root Flight-vs-Ground volcano (flight main effect, averaged over the two light treatments; predominantly upregulation).</w:t>
       </w:r>
     </w:p>
     <w:p>

</xml_diff>

<commit_message>
Update text for the microbiome re-run
Manuscript, draft, illustrated manuscript, README, site, SA comparison
and sessionInfo now report the re-run: 78 fungal ASVs; term-wise
PERMANOVA (flight R2 0.28 leaf bacteria, 0.36 leaf fungi); ASV024 as an
Erwiniaceae ASV (Pantoea at 49% bootstrap); the Fusarium root result as
not significant; MOFA+ on 18 leaf samples; 31 module-taxon pairs;
FAPROTAX 1.2.12 groups; the three relabelled samples; DADA2 1.40.0 and
UNITE 01.12.2017. TODOs for PERMANOVA, MOFA+ and FAPROTAX removed.
Discussion point (1) no longer says bacteria change more than fungi.

microbiome/RERUN_2026-10-15.md records inputs, controls and every number.

Co-Authored-By: Claude Opus 5.5 <noreply@anthropic.com>
</commit_message>
<xml_diff>
--- a/manuscript_with_figures.docx
+++ b/manuscript_with_figures.docx
@@ -37,16 +37,7 @@
         <w:t>Solanum lycopersicum</w:t>
       </w:r>
       <w:r>
-        <w:t xml:space="preserve"> cv. Red Robin) grown aboard the International Space Station (ISS) as part of the VEG-05 experiment, integrating 16S rRNA and ITS amplicon sequencing (OSD-766) with host transcriptomics (OSD-767) across two tissues (leaf, adventitious root) and two light treatments (red-rich vs. blue-rich LED). DADA2 processing yielded 348 bacterial and 77 fungal ASVs from 142 and 141 samples respectively. Leaf bacterial community composition differed among flight and light groups (PERMANOVA R²=0.42 for the full flight × light model, p=0.001), and flight samples had higher bacterial alpha diversity (Observed ASVs: Flight 17.8–25.8 vs. Ground 10.0–15.2). The spaceflight transcriptional response was strongly light-dependent: under blue light, 4,716 differentially expressed genes (DEGs) were detected in leaves versus only 523 under red light. WGCNA identified a 169-gene adventitious root module correlated with fungal dysbiosis (r=−0.85, padj=0.009) but not with flight status (r=−0.38, padj=0.32), representing a microbe-driven host transcriptional signature independent of the direct spaceflight stimulus. MOFA+ integration across three omics layers confirmed a dominant flight-associated factor (48% transcriptome variance) </w:t>
-      </w:r>
-      <w:r>
-        <w:rPr>
-          <w:b/>
-        </w:rPr>
-        <w:t>[TODO: the MOFA+ microbiome views were built from mismatched samples; re-run before comparing bacterial and fungal responses]</w:t>
-      </w:r>
-      <w:r>
-        <w:t>. The most abundant FAPROTAX-predicted bacterial functions were aerobic chemoheterotrophy, nitrogen fixation, dark hydrogen oxidation and methanol oxidation. These findings demonstrate that spaceflight restructures plant-associated microbiomes in a tissue- and light-specific manner, with implications for crop production systems in long-duration space missions.</w:t>
+        <w:t xml:space="preserve"> cv. Red Robin) grown aboard the International Space Station (ISS) as part of the VEG-05 experiment, integrating 16S rRNA and ITS amplicon sequencing (OSD-766) with host transcriptomics (OSD-767) across two tissues (leaf, adventitious root) and two light treatments (red-rich vs. blue-rich LED). DADA2 processing yielded 348 bacterial and 78 fungal ASVs from 142 and 141 samples respectively. Spaceflight accounted for 28% of the variation in leaf bacterial community composition (PERMANOVA, p=0.001), and flight samples had higher bacterial alpha diversity (Observed ASVs: Flight 17.8–25.8 vs. Ground 10.0–15.2). The spaceflight transcriptional response was strongly light-dependent: under blue light, 4,716 differentially expressed genes (DEGs) were detected in leaves versus only 523 under red light. WGCNA identified a 169-gene adventitious root module correlated with fungal dysbiosis (r=−0.85, padj=0.009) but not with flight status (r=−0.38, padj=0.32), representing a microbe-driven host transcriptional signature independent of the direct spaceflight stimulus. MOFA+ integration of 18 leaf samples across three omics layers found a dominant flight-associated factor (44% of transcriptome variance). The most abundant FAPROTAX-predicted bacterial functions were (aerobic) chemoheterotrophy, nitrogen fixation and ureolysis. These findings demonstrate that spaceflight restructures plant-associated microbiomes in a tissue- and light-specific manner, with implications for crop production systems in long-duration space missions.</w:t>
       </w:r>
     </w:p>
     <w:p>
@@ -149,7 +140,7 @@
     </w:p>
     <w:p>
       <w:r>
-        <w:t>Raw sequencing data and metadata were obtained from NASA's Open Science Data Repository (OSDR): OSD-766 (microbiome amplicon sequencing [3]) and OSD-767 (host RNA-seq [23]). The VEG-05 experiment grew tomato cv. Red Robin aboard the ISS under red-rich (90% red:10% blue) or blue-rich (50% red:50% blue) LED lighting, with ground controls at Kennedy Space Center. Metadata were parsed from ISA-Tab format, and a crosswalk table linking microbiome and RNA-seq samples by plant ID, flight status, light treatment, and tissue was constructed.</w:t>
+        <w:t>Raw sequencing data and metadata were obtained from NASA's Open Science Data Repository (OSDR): OSD-766 (microbiome amplicon sequencing [3]) and OSD-767 (host RNA-seq [23]). The VEG-05 experiment grew tomato cv. Red Robin aboard the ISS under red-rich (90% red:10% blue) or blue-rich (50% red:50% blue) LED lighting, with ground controls at Kennedy Space Center. Metadata were parsed from ISA-Tab format, and a crosswalk table linking microbiome and RNA-seq samples by plant ID, flight status, light treatment, and tissue was constructed. OSD-766 labels the adventitious-root samples of ground plants SN02, SN04 and SN05 blue-rich, whereas it labels those plants' leaf samples red-rich and OSD-767 names their root RNA-seq samples Red; these three samples were treated as red-rich.</w:t>
       </w:r>
     </w:p>
     <w:p>
@@ -162,7 +153,7 @@
     </w:p>
     <w:p>
       <w:r>
-        <w:t>16S rRNA (V4 region, 515F/806R primers) and ITS2 (ITS3F/ITS4 primers) reads were processed using DADA2 v1.34.0 [8] in R. For 16S, primers were already removed; reads were truncated at 240 bp (R1) and 160 bp (R2) with maxEE=2, length-filtered to 200–260 bp, and pooled for denoising. Taxonomy was assigned against SILVA 138.1 [9]. Chloroplast and mitochondrial ASVs were removed prior to community analysis. For ITS, primers were removed with cutadapt [10]; R2 reads were truncated at 180 bp due to quality degradation; taxonomy was assigned against UNITE v7 (October 2017) [11].</w:t>
+        <w:t>16S rRNA (V4 region, 515F/806R primers) and ITS2 (ITS3F/ITS4 primers) reads were processed using DADA2 v1.40.0 [8] in R. For 16S, primers were already removed; reads were truncated at 240 bp (R1) and 160 bp (R2) with maxEE=2, length-filtered to 200–260 bp, and pooled for denoising. Taxonomy was assigned against SILVA 138.1 [9]. Chloroplast and mitochondrial ASVs were removed prior to community analysis. For ITS, primers were removed with cutadapt [10]; R2 reads were truncated at 180 bp due to quality degradation; taxonomy was assigned against the UNITE v7.2 QIIME release (1 December 2017, 99% clusters) [11]. Taxonomy was assigned with a fixed random seed and DADA2's default 50% bootstrap threshold.</w:t>
       </w:r>
     </w:p>
     <w:p>
@@ -188,7 +179,7 @@
     </w:p>
     <w:p>
       <w:r>
-        <w:t>Alpha diversity (Observed ASVs, Shannon index) was computed on unfiltered data using phyloseq [15]. Beta diversity was assessed via Bray-Curtis dissimilarity and PERMANOVA (999 permutations) using vegan [16]. A dysbiosis index was calculated for each flight sample as its mean Bray-Curtis distance to all ground samples of the same compartment (both light treatments), divided by the mean pairwise distance among those ground samples. Differential abundance testing used ALDEx2 [17] with 128 Monte Carlo instances, requiring both a Benjamini–Hochberg-adjusted Welch p &lt; 0.05 and |effect size| &gt; 1; positive effects are higher in flight.</w:t>
+        <w:t>Alpha diversity (Observed ASVs, Shannon index) was computed on unfiltered data using phyloseq [15]. Beta diversity was assessed via Bray-Curtis dissimilarity and PERMANOVA (999 permutations; terms added sequentially: flight, light, flight × light) using vegan [16]. A dysbiosis index was calculated for each flight sample as its mean Bray-Curtis distance to all ground samples of the same compartment (both light treatments), divided by the mean pairwise distance among those ground samples. Differential abundance testing used ALDEx2 [17] with 128 Monte Carlo instances, requiring both a Benjamini–Hochberg-adjusted Welch p &lt; 0.05 and |effect size| &gt; 1; positive effects are higher in flight.</w:t>
       </w:r>
     </w:p>
     <w:p>
@@ -214,7 +205,7 @@
     </w:p>
     <w:p>
       <w:r>
-        <w:t>MOFA2 [6] was trained on 21 leaf samples with matched data across three views: transcriptome (2,000 most variable genes), 16S (348 ASVs), and ITS (77 ASVs). The model was trained with 5 factors and default priors. Factor-trait correlations were computed using Spearman's rank correlation with BH correction.</w:t>
+        <w:t>MOFA2 [6] was trained on the 18 leaf samples with RNA-seq, 16S and ITS data from the same leaf, in three views: transcriptome (2,000 most variable genes), 16S (the 101 bacterial ASVs detected in those samples), and ITS (40 fungal ASVs). The model was trained with 5 factors and default priors. Factor-trait correlations were computed using Spearman's rank correlation with BH correction.</w:t>
       </w:r>
     </w:p>
     <w:p>
@@ -240,7 +231,7 @@
     </w:p>
     <w:p>
       <w:r>
-        <w:t>Bacterial functional profiles were predicted using FAPROTAX v1.2 [19] with a custom Python implementation of the collapse algorithm. Fungal ecological guilds were assigned using genus-level lookup tables based on FUNGuild [20] categories.</w:t>
+        <w:t>Bacterial functional profiles were predicted for the 348 bacterial ASVs using FAPROTAX 1.2.12 [19] and its collapse_table.py with default settings (whole-word taxon matching). Fungal ecological guilds were assigned using genus-level lookup tables based on FUNGuild [20] categories.</w:t>
       </w:r>
     </w:p>
     <w:p>
@@ -274,21 +265,12 @@
     </w:p>
     <w:p>
       <w:r>
-        <w:t>DADA2 processing of 16S rRNA reads yielded 544 ASVs from 142 samples (3,558,814 non-chimeric reads, 89.8% retention). After removing chloroplast (38.9% of reads) and mitochondrial (21.5%) sequences, 348 bacterial ASVs remained. ITS processing yielded 77 fungal ASVs from 141 samples (160,316 reads, 15.8% retention).</w:t>
+        <w:t>DADA2 processing of 16S rRNA reads yielded 544 ASVs from 142 samples (3,558,814 non-chimeric reads, 89.8% retention). After removing chloroplast (38.9% of reads) and mitochondrial (21.5%) sequences, 348 bacterial ASVs remained. ITS processing yielded 78 fungal ASVs (156,102 reads, 15.4% of primer-trimmed reads); 121 of the 141 samples retained reads.</w:t>
       </w:r>
     </w:p>
     <w:p>
       <w:r>
-        <w:t xml:space="preserve">Bacterial community composition differed among flight and light groups in leaves (PERMANOVA, full flight × light model: R²=0.42, F=4.02, p=0.001, n=21) and adventitious roots (R²=0.33, F=2.93, p=0.001, n=15; Table S4). These R² values are for the whole model, not for spaceflight alone </w:t>
-      </w:r>
-      <w:r>
-        <w:rPr>
-          <w:b/>
-        </w:rPr>
-        <w:t>[TODO: term-wise PERMANOVA]</w:t>
-      </w:r>
-      <w:r>
-        <w:t>. In leaves, bacterial alpha diversity was higher in flight samples: Observed ASVs ranged from 17.8–25.8 in flight versus 10.0–15.2 in ground controls (Fig. 2A; Table S3). The Shannon index showed a similar pattern, with flight blue-light samples reaching 2.18 versus 0.80 in ground blue-light controls.</w:t>
+        <w:t>Spaceflight changed bacterial community composition in leaves (PERMANOVA flight term: R²=0.28, F=8.24, p=0.001, n=21) and adventitious roots (R²=0.29, F=5.90, p=0.001, n=15; Table S4). Light quality had no significant main effect in either tissue, but the flight × light interaction did (leaf R²=0.11, p=0.035; root R²=0.11, p=0.027). In leaves, bacterial alpha diversity was higher in flight samples: Observed ASVs ranged from 17.8–25.8 in flight versus 10.0–15.2 in ground controls (Fig. 2A; Table S3). The Shannon index showed a similar pattern, with flight blue-light samples reaching 2.18 versus 0.80 in ground blue-light controls.</w:t>
       </w:r>
     </w:p>
     <w:p>
@@ -343,7 +325,7 @@
     </w:p>
     <w:p>
       <w:r>
-        <w:t>The dysbiosis index quantified community displacement relative to ground controls. Leaf bacterial communities showed a 2.06-fold increase in dysbiosis during flight (2.06 ± 0.99 vs. 1.00 ± 0.47, Fig. 2B). Fungal communities showed even greater displacement (ITS leaf: 3.64 ± 2.78 vs. 1.00 ± 0.24), though the PERMANOVA model was not significant (model R²=0.45, p=0.054). Adventitious root fungal community composition also differed among groups (model R²=0.65, F=8.19, p=0.001).</w:t>
+        <w:t>The dysbiosis index quantified community displacement relative to ground controls. Leaf bacterial communities showed a 2.06-fold increase in dysbiosis during flight (2.06 ± 0.99 vs. 1.00 ± 0.47, Fig. 2B). Fungal communities showed even greater displacement (ITS leaf: 3.69 ± 2.78 vs. 1.00 ± 0.22), and spaceflight changed leaf fungal composition (flight term R²=0.36, F=9.35, p=0.007, n=18). Adventitious root fungal community composition differed by flight (R²=0.40, F=13.1, p=0.001), light (R²=0.19, p=0.005) and their interaction (R²=0.16, p=0.006; n=12).</w:t>
       </w:r>
     </w:p>
     <w:p>
@@ -448,7 +430,7 @@
     </w:p>
     <w:p>
       <w:r>
-        <w:t xml:space="preserve">ALDEx2 identified few taxa with significant differential abundance under the conservative dual criterion (BH-adjusted p &lt; 0.05 and |effect| &gt; 1), all of them more abundant in flight. In leaf 16S, </w:t>
+        <w:t xml:space="preserve">ALDEx2 identified few taxa with significant differential abundance under the conservative dual criterion (BH-adjusted p &lt; 0.05 and |effect| &gt; 1), all of them more abundant in flight. In leaf 16S, an Erwiniaceae ASV (ASV024; assigned to </w:t>
       </w:r>
       <w:r>
         <w:rPr>
@@ -457,7 +439,7 @@
         <w:t>Pantoea</w:t>
       </w:r>
       <w:r>
-        <w:t xml:space="preserve"> (ASV024) was enriched in flight (effect=+1.10). In ITS, </w:t>
+        <w:t xml:space="preserve"> with 49% bootstrap support, just below the 50% threshold) was enriched in flight (effect=+1.10). In ITS, </w:t>
       </w:r>
       <w:r>
         <w:rPr>
@@ -466,16 +448,7 @@
         <w:t>Penicillium citrinum</w:t>
       </w:r>
       <w:r>
-        <w:t xml:space="preserve"> (ASV003) was enriched in flight leaves (effect=+1.82). In adventitious roots, </w:t>
-      </w:r>
-      <w:r>
-        <w:rPr>
-          <w:i/>
-        </w:rPr>
-        <w:t>Fusarium solani</w:t>
-      </w:r>
-      <w:r>
-        <w:t xml:space="preserve"> (ITS ASV006; effect=+1.82) and three bacterial taxa (16S ASV004, </w:t>
+        <w:t xml:space="preserve"> (ASV003) was enriched in flight leaves (effect=+1.90). In adventitious roots, three bacterial taxa (16S ASV004, </w:t>
       </w:r>
       <w:r>
         <w:rPr>
@@ -493,7 +466,16 @@
         <w:t>Dyadobacter</w:t>
       </w:r>
       <w:r>
-        <w:t>, +2.22) were enriched in flight.</w:t>
+        <w:t xml:space="preserve">, +2.22) were enriched in flight. A </w:t>
+      </w:r>
+      <w:r>
+        <w:rPr>
+          <w:i/>
+        </w:rPr>
+        <w:t>Fusarium</w:t>
+      </w:r>
+      <w:r>
+        <w:t xml:space="preserve"> ASV (ITS ASV006) had a similar effect in roots (+1.91) but did not pass the threshold (BH-adjusted p=0.053).</w:t>
       </w:r>
     </w:p>
     <w:p>
@@ -2285,21 +2267,12 @@
     </w:p>
     <w:p>
       <w:r>
-        <w:t xml:space="preserve">MOFA+ integration of 21 matched leaf samples across three omics views (transcriptome: 2,000 genes; 16S: 348 ASVs; ITS: 77 ASVs) identified 5 factors </w:t>
-      </w:r>
-      <w:r>
-        <w:rPr>
-          <w:b/>
-        </w:rPr>
-        <w:t>[TODO: the 16S and ITS views were built from mismatched samples (tissue not matched, columns misordered); the microbiome variance fractions and Factor 2–3 associations need re-running]</w:t>
-      </w:r>
-      <w:r>
-        <w:t>. Factor 1 was the dominant signal, explaining 48.0% of transcriptome variance, 12.0% of 16S variance, and 3.0% of ITS variance (Fig. 5A). Factor 1 was significantly correlated with flight status (Spearman ρ=−0.76, padj=0.001; Fig. 5B), confirming that spaceflight is the primary axis of coordinated variation across omics layers.</w:t>
+        <w:t>MOFA+ integration of the 18 leaf samples with RNA-seq, 16S and ITS data from the same leaf (transcriptome: 2,000 genes; 16S: 101 ASVs; ITS: 40 ASVs) identified 5 factors. Factor 1 was the dominant signal, explaining 44.4% of transcriptome variance, 9.0% of 16S variance, and 7.0% of ITS variance (Fig. 5A). Factor 1 was significantly correlated with flight status (Spearman ρ=−0.68, padj=0.037; Fig. 5B) and nearly as strongly with light treatment (ρ=+0.63, padj=0.053); flight and light are partly confounded in these samples, because only one flight blue-light leaf has ITS data.</w:t>
       </w:r>
     </w:p>
     <w:p>
       <w:r>
-        <w:t>Factor 2 showed a trend toward correlation with 16S dysbiosis (ρ=−0.52, p=0.018, padj=0.089), while Factor 3 trended with both light treatment (ρ=0.52) and ITS dysbiosis (ρ=0.50). The transcriptome contributed the highest-weighted features to all factors, reflecting its greater dimensionality, but microbial features were consistently present in the top weights (Fig. S6).</w:t>
+        <w:t>Factor 3 trended with 16S dysbiosis (ρ=−0.61, p=0.008, padj=0.053); no other factor–trait correlation had padj &lt; 0.1. The transcriptome contributed the highest-weighted features to Factors 1–4 and 16S ASVs to Factor 5 (Fig. S6).</w:t>
       </w:r>
     </w:p>
     <w:p>
@@ -2399,7 +2372,7 @@
         <w:t>*Figure 5B.</w:t>
       </w:r>
       <w:r>
-        <w:t xml:space="preserve"> MOFA+ factor–trait correlations; Factor 1 captures flight (ρ=−0.76).*</w:t>
+        <w:t xml:space="preserve"> MOFA+ factor–trait correlations; Factor 1 captures flight (ρ=−0.68).*</w:t>
       </w:r>
     </w:p>
     <w:p>
@@ -2412,7 +2385,16 @@
     </w:p>
     <w:p>
       <w:r>
-        <w:t xml:space="preserve">Bipartite correlation networks identified 29 significant module-taxon relationships (BH padj &lt; 0.05), predominantly in leaf 16S (28 of 29; Fig. 6; Table S9). The flight-associated turquoise module positively correlated with </w:t>
+        <w:t xml:space="preserve">Bipartite correlation networks identified 31 significant module-taxon relationships (BH padj &lt; 0.05), predominantly in leaf 16S (28 of 31; Fig. 6; Table S9). The other three link adventitious-root modules to fungal ASVs, two of them to a </w:t>
+      </w:r>
+      <w:r>
+        <w:rPr>
+          <w:i/>
+        </w:rPr>
+        <w:t>Fusarium</w:t>
+      </w:r>
+      <w:r>
+        <w:t xml:space="preserve"> ASV (ITS ASV006; blue module ρ=−0.93, turquoise ρ=+0.91). The flight-associated turquoise module positively correlated with </w:t>
       </w:r>
       <w:r>
         <w:rPr>
@@ -2439,16 +2421,7 @@
         <w:t>Azospirillum</w:t>
       </w:r>
       <w:r>
-        <w:t xml:space="preserve"> (ρ=+0.68, padj=0.012) — all genera associated with plant growth promotion and nitrogen fixation. The anti-correlated blue module showed the inverse pattern with these same taxa. The brown module correlated negatively with </w:t>
-      </w:r>
-      <w:r>
-        <w:rPr>
-          <w:i/>
-        </w:rPr>
-        <w:t>Pantoea</w:t>
-      </w:r>
-      <w:r>
-        <w:t xml:space="preserve"> (ρ=−0.79, padj=0.003) and </w:t>
+        <w:t xml:space="preserve"> (ρ=+0.68, padj=0.012) — all genera associated with plant growth promotion and nitrogen fixation. The anti-correlated blue module showed the inverse pattern with these same taxa. The brown module correlated negatively with the flight-enriched Erwiniaceae ASV (ASV024; ρ=−0.79, padj=0.003) and </w:t>
       </w:r>
       <w:r>
         <w:rPr>
@@ -2520,7 +2493,7 @@
     </w:p>
     <w:p>
       <w:r>
-        <w:t xml:space="preserve">FAPROTAX assigned bacterial ASVs to 26 functional categories (Table S6). By read count the largest were aerobic chemoheterotrophy (787,792 reads, 185 taxa), nitrogen fixation (164,614 reads, 12 taxa), dark hydrogen oxidation (103,694 reads, 20 taxa), methanol oxidation (96,687 reads, 15 taxa) and methanotrophy (96,514 reads, 15 taxa) (Fig. 7). The methanol oxidation and methanotrophy assignments were primarily </w:t>
+        <w:t xml:space="preserve">FAPROTAX assigned 185 of the 348 bacterial ASVs to 44 functional groups (Table S6). By read count the largest were chemoheterotrophy (379,596 reads, 160 ASVs) and its subset aerobic chemoheterotrophy (377,996 reads, 144 ASVs), nitrogen fixation (166,177 reads, 14 ASVs) and ureolysis (139,142 reads, 17 ASVs) (Fig. 7). FAPROTAX matches whole taxon names, so the 14 ASVs of SILVA's merged genus </w:t>
       </w:r>
       <w:r>
         <w:rPr>
@@ -2529,16 +2502,7 @@
         <w:t>Methylobacterium-Methylorubrum</w:t>
       </w:r>
       <w:r>
-        <w:t xml:space="preserve">, the same genus showing the strongest positive correlation with the flight-associated WGCNA module </w:t>
-      </w:r>
-      <w:r>
-        <w:rPr>
-          <w:b/>
-        </w:rPr>
-        <w:t>[TODO: the FAPROTAX collapse misparses three database lines, moving 31 ASVs into spurious categories, and matches taxon names as substrings (*Methylobacterium* is a methylotroph, not a methanotroph); re-run with a corrected parser]</w:t>
-      </w:r>
-      <w:r>
-        <w:t>.</w:t>
+        <w:t>, the genus most strongly correlated with the flight-associated turquoise module, received no function. Treating the hyphenated name as separate words adds all 14 to methanol oxidation and methylotrophy (methanol oxidation then totals 96,687 reads), but not to methanotrophy.</w:t>
       </w:r>
     </w:p>
     <w:p>
@@ -2620,7 +2584,7 @@
         <w:t>*Figure 7.</w:t>
       </w:r>
       <w:r>
-        <w:t xml:space="preserve"> FAPROTAX predicted bacterial functions (aerobic chemoheterotrophy, N fixation, methanotrophy, methanol oxidation).*</w:t>
+        <w:t xml:space="preserve"> FAPROTAX predicted bacterial functions (FAPROTAX 1.2.12; the 15 largest groups by read count: chemoheterotrophy, nitrogen fixation, ureolysis and others).*</w:t>
       </w:r>
     </w:p>
     <w:p>
@@ -2633,7 +2597,7 @@
     </w:p>
     <w:p>
       <w:r>
-        <w:t>This study presents the first integrated multi-omics analysis of plant-microbiome interactions in the ISS VEG-05 experiment. Our findings reveal three key insights: (1) spaceflight restructures leaf bacterial communities more than fungal communities, with increased alpha diversity in flight; (2) the host transcriptional response to spaceflight is strongly light-dependent, particularly in leaves; and (3) a subset of host genes responds to microbial community changes independently of the direct spaceflight stimulus, providing evidence for microbe-driven host regulation.</w:t>
+        <w:t>This study presents the first integrated multi-omics analysis of plant-microbiome interactions in the ISS VEG-05 experiment. Our findings reveal three key insights: (1) spaceflight restructures both the bacterial and the fungal communities of leaves, with increased bacterial alpha diversity in flight; (2) the host transcriptional response to spaceflight is strongly light-dependent, particularly in leaves; and (3) a subset of host genes responds to microbial community changes independently of the direct spaceflight stimulus, providing evidence for microbe-driven host regulation.</w:t>
       </w:r>
     </w:p>
     <w:p>
@@ -2719,7 +2683,7 @@
     </w:p>
     <w:p>
       <w:r>
-        <w:t>Several limitations should be noted. First, sample sizes are small (n=21 leaf, n=15 root for RNA-seq; n=1–6 per flight × light group for microbiome), limiting statistical power. Second, 16S leaf samples had very low bacterial read counts after host DNA removal (median 89 reads), precluding rarefaction and requiring reliance on relative abundance metrics. Third, the ITS dataset had uneven group representation, with some flight groups containing only 1–2 samples. Fourth, MOFA+ warned that Factor 1 may partially capture technical variation (detection rate differences), though the strong biological signal supports its interpretation as a flight factor. Fifth, FAPROTAX functional predictions are based on taxonomy and should be validated with metagenomic or metatranscriptomic data. Sixth, the FUNGuild analysis used manual genus-level assignment rather than the full database, reducing assignment confidence. Finally, this study is correlational; causal relationships between host transcription and microbiome changes require experimental validation, ideally in simulated microgravity conditions with microbiome manipulation.</w:t>
+        <w:t>Several limitations should be noted. First, sample sizes are small (n=21 leaf, n=15 root for RNA-seq; n=1–6 per flight × light group for microbiome), limiting statistical power. Second, 16S leaf samples had very low bacterial read counts after host DNA removal (median 89 reads), precluding rarefaction and requiring reliance on relative abundance metrics. Third, the ITS dataset had uneven group representation, with some flight groups containing only 1–2 samples, and two flight adventitious-root samples retained a single ITS read each. Fourth, MOFA+ warned that Factor 1 may partially capture technical variation (detection rate differences), though the strong biological signal supports its interpretation as a flight factor. Fifth, FAPROTAX functional predictions are based on taxonomy and should be validated with metagenomic or metatranscriptomic data. Sixth, the FUNGuild analysis used manual genus-level assignment rather than the full database, reducing assignment confidence. Finally, this study is correlational; causal relationships between host transcription and microbiome changes require experimental validation, ideally in simulated microgravity conditions with microbiome manipulation.</w:t>
       </w:r>
     </w:p>
     <w:p>
@@ -2881,7 +2845,7 @@
         <w:t>Figure 5B.</w:t>
       </w:r>
       <w:r>
-        <w:t xml:space="preserve"> MOFA+ factor–trait correlations; Factor 1 captures flight (ρ=−0.76).</w:t>
+        <w:t xml:space="preserve"> MOFA+ factor–trait correlations; Factor 1 captures flight (ρ=−0.68).</w:t>
       </w:r>
     </w:p>
     <w:p>
@@ -2909,7 +2873,7 @@
         <w:t>Figure 7.</w:t>
       </w:r>
       <w:r>
-        <w:t xml:space="preserve"> FAPROTAX predicted bacterial functions (aerobic chemoheterotrophy, N fixation, methanotrophy, methanol oxidation).</w:t>
+        <w:t xml:space="preserve"> FAPROTAX predicted bacterial functions (FAPROTAX 1.2.12; the 15 largest groups by read count: chemoheterotrophy, nitrogen fixation, ureolysis and others).</w:t>
       </w:r>
     </w:p>
     <w:p>

</xml_diff>

<commit_message>
FAPROTAX: treat hyphens as word separators
FAPROTAX matches whole words and by default counts '-' as part of a
word, so SILVA 138's merged genus names matched nothing: 20 ASVs, 14 of
them Methylobacterium-Methylorubrum. 05 now runs collapse_table.py with
--valid_word_symbols '' so each genus in a merged name is matched.

205 of 348 bacterial ASVs are assigned (was 185), still 44 groups.
Largest: chemoheterotrophy, aerobic chemoheterotrophy, ureolysis,
nitrogen fixation, methylotrophy (96,868 reads) and methanol oxidation
(96,687, the tracked figure), the last two almost entirely
Methylobacterium-Methylorubrum. Methanotrophy stays at 181 reads.
Table S6, Fig 7 and the text updated.

Co-Authored-By: Claude Opus 5.5 <noreply@anthropic.com>
</commit_message>
<xml_diff>
--- a/manuscript_with_figures.docx
+++ b/manuscript_with_figures.docx
@@ -37,7 +37,7 @@
         <w:t>Solanum lycopersicum</w:t>
       </w:r>
       <w:r>
-        <w:t xml:space="preserve"> cv. Red Robin) grown aboard the International Space Station (ISS) as part of the VEG-05 experiment, integrating 16S rRNA and ITS amplicon sequencing (OSD-766) with host transcriptomics (OSD-767) across two tissues (leaf, adventitious root) and two light treatments (red-rich vs. blue-rich LED). DADA2 processing yielded 348 bacterial and 78 fungal ASVs from 142 and 141 samples respectively. Spaceflight accounted for 28% of the variation in leaf bacterial community composition (PERMANOVA, p=0.001), and flight samples had higher bacterial alpha diversity (Observed ASVs: Flight 17.8–25.8 vs. Ground 10.0–15.2). The spaceflight transcriptional response was strongly light-dependent: under blue light, 4,716 differentially expressed genes (DEGs) were detected in leaves versus only 523 under red light. WGCNA identified a 169-gene adventitious root module correlated with fungal dysbiosis (r=−0.85, padj=0.009) but not with flight status (r=−0.38, padj=0.32), representing a microbe-driven host transcriptional signature independent of the direct spaceflight stimulus. MOFA+ integration of 18 leaf samples across three omics layers found a dominant flight-associated factor (44% of transcriptome variance). The most abundant FAPROTAX-predicted bacterial functions were (aerobic) chemoheterotrophy, nitrogen fixation and ureolysis. These findings demonstrate that spaceflight restructures plant-associated microbiomes in a tissue- and light-specific manner, with implications for crop production systems in long-duration space missions.</w:t>
+        <w:t xml:space="preserve"> cv. Red Robin) grown aboard the International Space Station (ISS) as part of the VEG-05 experiment, integrating 16S rRNA and ITS amplicon sequencing (OSD-766) with host transcriptomics (OSD-767) across two tissues (leaf, adventitious root) and two light treatments (red-rich vs. blue-rich LED). DADA2 processing yielded 348 bacterial and 78 fungal ASVs from 142 and 141 samples respectively. Spaceflight accounted for 28% of the variation in leaf bacterial community composition (PERMANOVA, p=0.001), and flight samples had higher bacterial alpha diversity (Observed ASVs: Flight 17.8–25.8 vs. Ground 10.0–15.2). The spaceflight transcriptional response was strongly light-dependent: under blue light, 4,716 differentially expressed genes (DEGs) were detected in leaves versus only 523 under red light. WGCNA identified a 169-gene adventitious root module correlated with fungal dysbiosis (r=−0.85, padj=0.009) but not with flight status (r=−0.38, padj=0.32), representing a microbe-driven host transcriptional signature independent of the direct spaceflight stimulus. MOFA+ integration of 18 leaf samples across three omics layers found a dominant flight-associated factor (44% of transcriptome variance). The most abundant FAPROTAX-predicted bacterial functions were (aerobic) chemoheterotrophy, ureolysis, nitrogen fixation and methylotrophy. These findings demonstrate that spaceflight restructures plant-associated microbiomes in a tissue- and light-specific manner, with implications for crop production systems in long-duration space missions.</w:t>
       </w:r>
     </w:p>
     <w:p>
@@ -231,7 +231,7 @@
     </w:p>
     <w:p>
       <w:r>
-        <w:t>Bacterial functional profiles were predicted for the 348 bacterial ASVs using FAPROTAX 1.2.12 [19] and its collapse_table.py with default settings (whole-word taxon matching). Fungal ecological guilds were assigned using genus-level lookup tables based on FUNGuild [20] categories.</w:t>
+        <w:t>Bacterial functional profiles were predicted for the 348 bacterial ASVs using FAPROTAX 1.2.12 [19] and its collapse_table.py (whole-word taxon matching, with hyphens treated as word separators so that each genus in SILVA's merged genus names is matched). Fungal ecological guilds were assigned using genus-level lookup tables based on FUNGuild [20] categories.</w:t>
       </w:r>
     </w:p>
     <w:p>
@@ -2493,7 +2493,7 @@
     </w:p>
     <w:p>
       <w:r>
-        <w:t xml:space="preserve">FAPROTAX assigned 185 of the 348 bacterial ASVs to 44 functional groups (Table S6). By read count the largest were chemoheterotrophy (379,596 reads, 160 ASVs) and its subset aerobic chemoheterotrophy (377,996 reads, 144 ASVs), nitrogen fixation (166,177 reads, 14 ASVs) and ureolysis (139,142 reads, 17 ASVs) (Fig. 7). FAPROTAX matches whole taxon names, so the 14 ASVs of SILVA's merged genus </w:t>
+        <w:t xml:space="preserve">FAPROTAX assigned 205 of the 348 bacterial ASVs to 44 functional groups (Table S6). By read count the largest were chemoheterotrophy (786,147 reads, 180 ASVs) and its subset aerobic chemoheterotrophy (688,214 reads, 150 ASVs), ureolysis (235,475 reads, 31 ASVs), nitrogen fixation (223,554 reads, 15 ASVs), methylotrophy (96,868 reads, 16 ASVs) and methanol oxidation (96,687 reads, 15 ASVs) (Fig. 7). The methylotrophy and methanol oxidation assignments were almost entirely </w:t>
       </w:r>
       <w:r>
         <w:rPr>
@@ -2502,7 +2502,16 @@
         <w:t>Methylobacterium-Methylorubrum</w:t>
       </w:r>
       <w:r>
-        <w:t>, the genus most strongly correlated with the flight-associated turquoise module, received no function. Treating the hyphenated name as separate words adds all 14 to methanol oxidation and methylotrophy (methanol oxidation then totals 96,687 reads), but not to methanotrophy.</w:t>
+        <w:t xml:space="preserve"> (14 ASVs), the genus most strongly correlated with the flight-associated turquoise module. Methanotrophy was minor (181 reads, 1 ASV): </w:t>
+      </w:r>
+      <w:r>
+        <w:rPr>
+          <w:i/>
+        </w:rPr>
+        <w:t>Methylobacterium</w:t>
+      </w:r>
+      <w:r>
+        <w:t xml:space="preserve"> oxidizes methanol, not methane.</w:t>
       </w:r>
     </w:p>
     <w:p>
@@ -2584,7 +2593,7 @@
         <w:t>*Figure 7.</w:t>
       </w:r>
       <w:r>
-        <w:t xml:space="preserve"> FAPROTAX predicted bacterial functions (FAPROTAX 1.2.12; the 15 largest groups by read count: chemoheterotrophy, nitrogen fixation, ureolysis and others).*</w:t>
+        <w:t xml:space="preserve"> FAPROTAX predicted bacterial functions (FAPROTAX 1.2.12; the 15 largest groups by read count: chemoheterotrophy, ureolysis, nitrogen fixation, methylotrophy and others).*</w:t>
       </w:r>
     </w:p>
     <w:p>
@@ -2873,7 +2882,7 @@
         <w:t>Figure 7.</w:t>
       </w:r>
       <w:r>
-        <w:t xml:space="preserve"> FAPROTAX predicted bacterial functions (FAPROTAX 1.2.12; the 15 largest groups by read count: chemoheterotrophy, nitrogen fixation, ureolysis and others).</w:t>
+        <w:t xml:space="preserve"> FAPROTAX predicted bacterial functions (FAPROTAX 1.2.12; the 15 largest groups by read count: chemoheterotrophy, ureolysis, nitrogen fixation, methylotrophy and others).</w:t>
       </w:r>
     </w:p>
     <w:p>

</xml_diff>